<commit_message>
updating changes for Milestone3
</commit_message>
<xml_diff>
--- a/Milestone3/CSC500 Module 8 - Portfolio Milestone.docx
+++ b/Milestone3/CSC500 Module 8 - Portfolio Milestone.docx
@@ -2069,6 +2069,7 @@
         <w:t xml:space="preserve"> not any(</w:t>
       </w:r>
       <w:proofErr w:type="spellStart"/>
+      <w:proofErr w:type="gramStart"/>
       <w:r>
         <w:rPr>
           <w:rFonts w:ascii="Calibri" w:hAnsi="Calibri" w:cs="Calibri"/>
@@ -2076,6 +2077,7 @@
         <w:t>char.isalpha</w:t>
       </w:r>
       <w:proofErr w:type="spellEnd"/>
+      <w:proofErr w:type="gramEnd"/>
       <w:r>
         <w:rPr>
           <w:rFonts w:ascii="Calibri" w:hAnsi="Calibri" w:cs="Calibri"/>
@@ -2101,7 +2103,21 @@
           <w:rFonts w:ascii="Calibri" w:hAnsi="Calibri" w:cs="Calibri"/>
         </w:rPr>
         <w:br/>
-        <w:t xml:space="preserve">            print("Warning!! Item Name must contain at least one alphabet!!\n")</w:t>
+        <w:t xml:space="preserve">            </w:t>
+      </w:r>
+      <w:proofErr w:type="gramStart"/>
+      <w:r>
+        <w:rPr>
+          <w:rFonts w:ascii="Calibri" w:hAnsi="Calibri" w:cs="Calibri"/>
+        </w:rPr>
+        <w:t>print(</w:t>
+      </w:r>
+      <w:proofErr w:type="gramEnd"/>
+      <w:r>
+        <w:rPr>
+          <w:rFonts w:ascii="Calibri" w:hAnsi="Calibri" w:cs="Calibri"/>
+        </w:rPr>
+        <w:t>"Warning!! Item Name must contain at least one alphabet!!\n")</w:t>
       </w:r>
       <w:r>
         <w:rPr>
@@ -2150,9 +2166,17 @@
         <w:rPr>
           <w:rFonts w:ascii="Calibri" w:hAnsi="Calibri" w:cs="Calibri"/>
         </w:rPr>
-        <w:t>item_name.isnumeric</w:t>
-      </w:r>
-      <w:proofErr w:type="spellEnd"/>
+        <w:t>item_</w:t>
+      </w:r>
+      <w:proofErr w:type="gramStart"/>
+      <w:r>
+        <w:rPr>
+          <w:rFonts w:ascii="Calibri" w:hAnsi="Calibri" w:cs="Calibri"/>
+        </w:rPr>
+        <w:t>name.isnumeric</w:t>
+      </w:r>
+      <w:proofErr w:type="spellEnd"/>
+      <w:proofErr w:type="gramEnd"/>
       <w:r>
         <w:rPr>
           <w:rFonts w:ascii="Calibri" w:hAnsi="Calibri" w:cs="Calibri"/>
@@ -2164,7 +2188,35 @@
           <w:rFonts w:ascii="Calibri" w:hAnsi="Calibri" w:cs="Calibri"/>
         </w:rPr>
         <w:br/>
-        <w:t xml:space="preserve">            print("Warning!! Item Name cannot contains only Numerical Characters.\n")</w:t>
+        <w:t xml:space="preserve">            </w:t>
+      </w:r>
+      <w:proofErr w:type="gramStart"/>
+      <w:r>
+        <w:rPr>
+          <w:rFonts w:ascii="Calibri" w:hAnsi="Calibri" w:cs="Calibri"/>
+        </w:rPr>
+        <w:t>print(</w:t>
+      </w:r>
+      <w:proofErr w:type="gramEnd"/>
+      <w:r>
+        <w:rPr>
+          <w:rFonts w:ascii="Calibri" w:hAnsi="Calibri" w:cs="Calibri"/>
+        </w:rPr>
+        <w:t xml:space="preserve">"Warning!! Item Name cannot </w:t>
+      </w:r>
+      <w:proofErr w:type="gramStart"/>
+      <w:r>
+        <w:rPr>
+          <w:rFonts w:ascii="Calibri" w:hAnsi="Calibri" w:cs="Calibri"/>
+        </w:rPr>
+        <w:t>contains</w:t>
+      </w:r>
+      <w:proofErr w:type="gramEnd"/>
+      <w:r>
+        <w:rPr>
+          <w:rFonts w:ascii="Calibri" w:hAnsi="Calibri" w:cs="Calibri"/>
+        </w:rPr>
+        <w:t xml:space="preserve"> only Numerical Characters.\n")</w:t>
       </w:r>
       <w:r>
         <w:rPr>
@@ -2205,14 +2257,29 @@
         <w:rPr>
           <w:rFonts w:ascii="Calibri" w:hAnsi="Calibri" w:cs="Calibri"/>
         </w:rPr>
-        <w:t>item_name.replace</w:t>
-      </w:r>
-      <w:proofErr w:type="spellEnd"/>
-      <w:r>
-        <w:rPr>
-          <w:rFonts w:ascii="Calibri" w:hAnsi="Calibri" w:cs="Calibri"/>
-        </w:rPr>
-        <w:t>(" ", "").</w:t>
+        <w:t>item_</w:t>
+      </w:r>
+      <w:proofErr w:type="gramStart"/>
+      <w:r>
+        <w:rPr>
+          <w:rFonts w:ascii="Calibri" w:hAnsi="Calibri" w:cs="Calibri"/>
+        </w:rPr>
+        <w:t>name.replace</w:t>
+      </w:r>
+      <w:proofErr w:type="spellEnd"/>
+      <w:proofErr w:type="gramEnd"/>
+      <w:r>
+        <w:rPr>
+          <w:rFonts w:ascii="Calibri" w:hAnsi="Calibri" w:cs="Calibri"/>
+        </w:rPr>
+        <w:t>(" ", ""</w:t>
+      </w:r>
+      <w:proofErr w:type="gramStart"/>
+      <w:r>
+        <w:rPr>
+          <w:rFonts w:ascii="Calibri" w:hAnsi="Calibri" w:cs="Calibri"/>
+        </w:rPr>
+        <w:t>).</w:t>
       </w:r>
       <w:proofErr w:type="spellStart"/>
       <w:r>
@@ -2222,6 +2289,7 @@
         <w:t>isalnum</w:t>
       </w:r>
       <w:proofErr w:type="spellEnd"/>
+      <w:proofErr w:type="gramEnd"/>
       <w:r>
         <w:rPr>
           <w:rFonts w:ascii="Calibri" w:hAnsi="Calibri" w:cs="Calibri"/>
@@ -2233,7 +2301,21 @@
           <w:rFonts w:ascii="Calibri" w:hAnsi="Calibri" w:cs="Calibri"/>
         </w:rPr>
         <w:br/>
-        <w:t xml:space="preserve">            print("Warning!! Item Name cannot contains Special Characters.\n")</w:t>
+        <w:t xml:space="preserve">            </w:t>
+      </w:r>
+      <w:proofErr w:type="gramStart"/>
+      <w:r>
+        <w:rPr>
+          <w:rFonts w:ascii="Calibri" w:hAnsi="Calibri" w:cs="Calibri"/>
+        </w:rPr>
+        <w:t>print(</w:t>
+      </w:r>
+      <w:proofErr w:type="gramEnd"/>
+      <w:r>
+        <w:rPr>
+          <w:rFonts w:ascii="Calibri" w:hAnsi="Calibri" w:cs="Calibri"/>
+        </w:rPr>
+        <w:t>"Warning!! Item Name cannot contains Special Characters.\n")</w:t>
       </w:r>
       <w:r>
         <w:rPr>
@@ -2439,7 +2521,21 @@
           <w:rFonts w:ascii="Calibri" w:hAnsi="Calibri" w:cs="Calibri"/>
         </w:rPr>
         <w:br/>
-        <w:t xml:space="preserve">                print("Warning!! Purchased Item Quantity should be greater than 0.\n")</w:t>
+        <w:t xml:space="preserve">                </w:t>
+      </w:r>
+      <w:proofErr w:type="gramStart"/>
+      <w:r>
+        <w:rPr>
+          <w:rFonts w:ascii="Calibri" w:hAnsi="Calibri" w:cs="Calibri"/>
+        </w:rPr>
+        <w:t>print(</w:t>
+      </w:r>
+      <w:proofErr w:type="gramEnd"/>
+      <w:r>
+        <w:rPr>
+          <w:rFonts w:ascii="Calibri" w:hAnsi="Calibri" w:cs="Calibri"/>
+        </w:rPr>
+        <w:t>"Warning!! Purchased Item Quantity should be greater than 0.\n")</w:t>
       </w:r>
       <w:r>
         <w:rPr>
@@ -2480,7 +2576,21 @@
           <w:rFonts w:ascii="Calibri" w:hAnsi="Calibri" w:cs="Calibri"/>
         </w:rPr>
         <w:br/>
-        <w:t xml:space="preserve">                print("Warning!! Purchased Item Quantity is too high.\n")</w:t>
+        <w:t xml:space="preserve">                </w:t>
+      </w:r>
+      <w:proofErr w:type="gramStart"/>
+      <w:r>
+        <w:rPr>
+          <w:rFonts w:ascii="Calibri" w:hAnsi="Calibri" w:cs="Calibri"/>
+        </w:rPr>
+        <w:t>print(</w:t>
+      </w:r>
+      <w:proofErr w:type="gramEnd"/>
+      <w:r>
+        <w:rPr>
+          <w:rFonts w:ascii="Calibri" w:hAnsi="Calibri" w:cs="Calibri"/>
+        </w:rPr>
+        <w:t>"Warning!! Purchased Item Quantity is too high.\n")</w:t>
       </w:r>
       <w:r>
         <w:rPr>
@@ -2535,7 +2645,21 @@
           <w:rFonts w:ascii="Calibri" w:hAnsi="Calibri" w:cs="Calibri"/>
         </w:rPr>
         <w:br/>
-        <w:t xml:space="preserve">            print("Warning!! Purchased Item Quantity must be an integer.\n")</w:t>
+        <w:t xml:space="preserve">            </w:t>
+      </w:r>
+      <w:proofErr w:type="gramStart"/>
+      <w:r>
+        <w:rPr>
+          <w:rFonts w:ascii="Calibri" w:hAnsi="Calibri" w:cs="Calibri"/>
+        </w:rPr>
+        <w:t>print(</w:t>
+      </w:r>
+      <w:proofErr w:type="gramEnd"/>
+      <w:r>
+        <w:rPr>
+          <w:rFonts w:ascii="Calibri" w:hAnsi="Calibri" w:cs="Calibri"/>
+        </w:rPr>
+        <w:t>"Warning!! Purchased Item Quantity must be an integer.\n")</w:t>
       </w:r>
       <w:r>
         <w:rPr>
@@ -2713,7 +2837,21 @@
           <w:rFonts w:ascii="Calibri" w:hAnsi="Calibri" w:cs="Calibri"/>
         </w:rPr>
         <w:br/>
-        <w:t xml:space="preserve">                print("Warning!! Purchased Item Price should be greater than 0.\n")</w:t>
+        <w:t xml:space="preserve">                </w:t>
+      </w:r>
+      <w:proofErr w:type="gramStart"/>
+      <w:r>
+        <w:rPr>
+          <w:rFonts w:ascii="Calibri" w:hAnsi="Calibri" w:cs="Calibri"/>
+        </w:rPr>
+        <w:t>print(</w:t>
+      </w:r>
+      <w:proofErr w:type="gramEnd"/>
+      <w:r>
+        <w:rPr>
+          <w:rFonts w:ascii="Calibri" w:hAnsi="Calibri" w:cs="Calibri"/>
+        </w:rPr>
+        <w:t>"Warning!! Purchased Item Price should be greater than 0.\n")</w:t>
       </w:r>
       <w:r>
         <w:rPr>
@@ -2733,7 +2871,21 @@
           <w:rFonts w:ascii="Calibri" w:hAnsi="Calibri" w:cs="Calibri"/>
         </w:rPr>
         <w:br/>
-        <w:t xml:space="preserve">                return round(price, 2)</w:t>
+        <w:t xml:space="preserve">                return </w:t>
+      </w:r>
+      <w:proofErr w:type="gramStart"/>
+      <w:r>
+        <w:rPr>
+          <w:rFonts w:ascii="Calibri" w:hAnsi="Calibri" w:cs="Calibri"/>
+        </w:rPr>
+        <w:t>round(</w:t>
+      </w:r>
+      <w:proofErr w:type="gramEnd"/>
+      <w:r>
+        <w:rPr>
+          <w:rFonts w:ascii="Calibri" w:hAnsi="Calibri" w:cs="Calibri"/>
+        </w:rPr>
+        <w:t>price, 2)</w:t>
       </w:r>
       <w:r>
         <w:rPr>
@@ -2767,7 +2919,21 @@
           <w:rFonts w:ascii="Calibri" w:hAnsi="Calibri" w:cs="Calibri"/>
         </w:rPr>
         <w:br/>
-        <w:t xml:space="preserve">            print("Warning!! Purchased Item Price must be an integer.\n")</w:t>
+        <w:t xml:space="preserve">            </w:t>
+      </w:r>
+      <w:proofErr w:type="gramStart"/>
+      <w:r>
+        <w:rPr>
+          <w:rFonts w:ascii="Calibri" w:hAnsi="Calibri" w:cs="Calibri"/>
+        </w:rPr>
+        <w:t>print(</w:t>
+      </w:r>
+      <w:proofErr w:type="gramEnd"/>
+      <w:r>
+        <w:rPr>
+          <w:rFonts w:ascii="Calibri" w:hAnsi="Calibri" w:cs="Calibri"/>
+        </w:rPr>
+        <w:t>"Warning!! Purchased Item Price must be an integer.\n")</w:t>
       </w:r>
       <w:r>
         <w:rPr>
@@ -2794,14 +2960,28 @@
         <w:rPr>
           <w:rFonts w:ascii="Calibri" w:hAnsi="Calibri" w:cs="Calibri"/>
         </w:rPr>
-        <w:t>get_valid_item_description</w:t>
-      </w:r>
-      <w:proofErr w:type="spellEnd"/>
-      <w:r>
-        <w:rPr>
-          <w:rFonts w:ascii="Calibri" w:hAnsi="Calibri" w:cs="Calibri"/>
-        </w:rPr>
-        <w:t>():</w:t>
+        <w:t>get_valid_item_</w:t>
+      </w:r>
+      <w:proofErr w:type="gramStart"/>
+      <w:r>
+        <w:rPr>
+          <w:rFonts w:ascii="Calibri" w:hAnsi="Calibri" w:cs="Calibri"/>
+        </w:rPr>
+        <w:t>description</w:t>
+      </w:r>
+      <w:proofErr w:type="spellEnd"/>
+      <w:r>
+        <w:rPr>
+          <w:rFonts w:ascii="Calibri" w:hAnsi="Calibri" w:cs="Calibri"/>
+        </w:rPr>
+        <w:t>(</w:t>
+      </w:r>
+      <w:proofErr w:type="gramEnd"/>
+      <w:r>
+        <w:rPr>
+          <w:rFonts w:ascii="Calibri" w:hAnsi="Calibri" w:cs="Calibri"/>
+        </w:rPr>
+        <w:t>):</w:t>
       </w:r>
       <w:r>
         <w:rPr>
@@ -2822,7 +3002,35 @@
         <w:rPr>
           <w:rFonts w:ascii="Calibri" w:hAnsi="Calibri" w:cs="Calibri"/>
         </w:rPr>
-        <w:t xml:space="preserve"> = input("Enter Purchased Item Description: \n").strip()</w:t>
+        <w:t xml:space="preserve"> = </w:t>
+      </w:r>
+      <w:proofErr w:type="gramStart"/>
+      <w:r>
+        <w:rPr>
+          <w:rFonts w:ascii="Calibri" w:hAnsi="Calibri" w:cs="Calibri"/>
+        </w:rPr>
+        <w:t>input(</w:t>
+      </w:r>
+      <w:proofErr w:type="gramEnd"/>
+      <w:r>
+        <w:rPr>
+          <w:rFonts w:ascii="Calibri" w:hAnsi="Calibri" w:cs="Calibri"/>
+        </w:rPr>
+        <w:t>"Enter Purchased Item Description: \n"</w:t>
+      </w:r>
+      <w:proofErr w:type="gramStart"/>
+      <w:r>
+        <w:rPr>
+          <w:rFonts w:ascii="Calibri" w:hAnsi="Calibri" w:cs="Calibri"/>
+        </w:rPr>
+        <w:t>).strip</w:t>
+      </w:r>
+      <w:proofErr w:type="gramEnd"/>
+      <w:r>
+        <w:rPr>
+          <w:rFonts w:ascii="Calibri" w:hAnsi="Calibri" w:cs="Calibri"/>
+        </w:rPr>
+        <w:t>()</w:t>
       </w:r>
       <w:r>
         <w:rPr>
@@ -2864,7 +3072,21 @@
           <w:rFonts w:ascii="Calibri" w:hAnsi="Calibri" w:cs="Calibri"/>
         </w:rPr>
         <w:br/>
-        <w:t xml:space="preserve">        print("Warning!! Purchased Item Description is too long.\n")</w:t>
+        <w:t xml:space="preserve">        </w:t>
+      </w:r>
+      <w:proofErr w:type="gramStart"/>
+      <w:r>
+        <w:rPr>
+          <w:rFonts w:ascii="Calibri" w:hAnsi="Calibri" w:cs="Calibri"/>
+        </w:rPr>
+        <w:t>print(</w:t>
+      </w:r>
+      <w:proofErr w:type="gramEnd"/>
+      <w:r>
+        <w:rPr>
+          <w:rFonts w:ascii="Calibri" w:hAnsi="Calibri" w:cs="Calibri"/>
+        </w:rPr>
+        <w:t>"Warning!! Purchased Item Description is too long.\n")</w:t>
       </w:r>
       <w:r>
         <w:rPr>
@@ -3393,11 +3615,19 @@
         <w:t xml:space="preserve">        for item in </w:t>
       </w:r>
       <w:proofErr w:type="spellStart"/>
-      <w:r>
-        <w:rPr>
-          <w:rFonts w:ascii="Calibri" w:hAnsi="Calibri" w:cs="Calibri"/>
-        </w:rPr>
-        <w:t>self.cart_items</w:t>
+      <w:proofErr w:type="gramStart"/>
+      <w:r>
+        <w:rPr>
+          <w:rFonts w:ascii="Calibri" w:hAnsi="Calibri" w:cs="Calibri"/>
+        </w:rPr>
+        <w:t>self.cart</w:t>
+      </w:r>
+      <w:proofErr w:type="gramEnd"/>
+      <w:r>
+        <w:rPr>
+          <w:rFonts w:ascii="Calibri" w:hAnsi="Calibri" w:cs="Calibri"/>
+        </w:rPr>
+        <w:t>_items</w:t>
       </w:r>
       <w:proofErr w:type="spellEnd"/>
       <w:r>
@@ -3414,6 +3644,7 @@
         <w:t xml:space="preserve">            if </w:t>
       </w:r>
       <w:proofErr w:type="spellStart"/>
+      <w:proofErr w:type="gramStart"/>
       <w:r>
         <w:rPr>
           <w:rFonts w:ascii="Calibri" w:hAnsi="Calibri" w:cs="Calibri"/>
@@ -3421,6 +3652,7 @@
         <w:t>item.itemName.lower</w:t>
       </w:r>
       <w:proofErr w:type="spellEnd"/>
+      <w:proofErr w:type="gramEnd"/>
       <w:r>
         <w:rPr>
           <w:rFonts w:ascii="Calibri" w:hAnsi="Calibri" w:cs="Calibri"/>
@@ -3432,9 +3664,17 @@
         <w:rPr>
           <w:rFonts w:ascii="Calibri" w:hAnsi="Calibri" w:cs="Calibri"/>
         </w:rPr>
-        <w:t>item_name.lower</w:t>
-      </w:r>
-      <w:proofErr w:type="spellEnd"/>
+        <w:t>item_</w:t>
+      </w:r>
+      <w:proofErr w:type="gramStart"/>
+      <w:r>
+        <w:rPr>
+          <w:rFonts w:ascii="Calibri" w:hAnsi="Calibri" w:cs="Calibri"/>
+        </w:rPr>
+        <w:t>name.lower</w:t>
+      </w:r>
+      <w:proofErr w:type="spellEnd"/>
+      <w:proofErr w:type="gramEnd"/>
       <w:r>
         <w:rPr>
           <w:rFonts w:ascii="Calibri" w:hAnsi="Calibri" w:cs="Calibri"/>
@@ -3459,9 +3699,17 @@
           <w:rFonts w:ascii="Calibri" w:hAnsi="Calibri" w:cs="Calibri"/>
         </w:rPr>
         <w:br/>
-        <w:t xml:space="preserve">                confirm = input(</w:t>
-      </w:r>
-      <w:proofErr w:type="spellStart"/>
+        <w:t xml:space="preserve">                confirm = </w:t>
+      </w:r>
+      <w:proofErr w:type="gramStart"/>
+      <w:r>
+        <w:rPr>
+          <w:rFonts w:ascii="Calibri" w:hAnsi="Calibri" w:cs="Calibri"/>
+        </w:rPr>
+        <w:t>input(</w:t>
+      </w:r>
+      <w:proofErr w:type="spellStart"/>
+      <w:proofErr w:type="gramEnd"/>
       <w:r>
         <w:rPr>
           <w:rFonts w:ascii="Calibri" w:hAnsi="Calibri" w:cs="Calibri"/>
@@ -3476,6 +3724,7 @@
         <w:t xml:space="preserve"> you want to Remove {</w:t>
       </w:r>
       <w:proofErr w:type="spellStart"/>
+      <w:proofErr w:type="gramStart"/>
       <w:r>
         <w:rPr>
           <w:rFonts w:ascii="Calibri" w:hAnsi="Calibri" w:cs="Calibri"/>
@@ -3483,11 +3732,26 @@
         <w:t>item.itemName</w:t>
       </w:r>
       <w:proofErr w:type="spellEnd"/>
-      <w:r>
-        <w:rPr>
-          <w:rFonts w:ascii="Calibri" w:hAnsi="Calibri" w:cs="Calibri"/>
-        </w:rPr>
-        <w:t>} from cart? (y/n).\n").lower()</w:t>
+      <w:proofErr w:type="gramEnd"/>
+      <w:r>
+        <w:rPr>
+          <w:rFonts w:ascii="Calibri" w:hAnsi="Calibri" w:cs="Calibri"/>
+        </w:rPr>
+        <w:t>} from cart? (y/n).\n"</w:t>
+      </w:r>
+      <w:proofErr w:type="gramStart"/>
+      <w:r>
+        <w:rPr>
+          <w:rFonts w:ascii="Calibri" w:hAnsi="Calibri" w:cs="Calibri"/>
+        </w:rPr>
+        <w:t>).lower</w:t>
+      </w:r>
+      <w:proofErr w:type="gramEnd"/>
+      <w:r>
+        <w:rPr>
+          <w:rFonts w:ascii="Calibri" w:hAnsi="Calibri" w:cs="Calibri"/>
+        </w:rPr>
+        <w:t>()</w:t>
       </w:r>
       <w:r>
         <w:rPr>
@@ -3504,13 +3768,29 @@
         <w:t xml:space="preserve">                    </w:t>
       </w:r>
       <w:proofErr w:type="spellStart"/>
-      <w:r>
-        <w:rPr>
-          <w:rFonts w:ascii="Calibri" w:hAnsi="Calibri" w:cs="Calibri"/>
-        </w:rPr>
-        <w:t>self.cart_items.remove</w:t>
-      </w:r>
-      <w:proofErr w:type="spellEnd"/>
+      <w:proofErr w:type="gramStart"/>
+      <w:r>
+        <w:rPr>
+          <w:rFonts w:ascii="Calibri" w:hAnsi="Calibri" w:cs="Calibri"/>
+        </w:rPr>
+        <w:t>self.cart</w:t>
+      </w:r>
+      <w:proofErr w:type="gramEnd"/>
+      <w:r>
+        <w:rPr>
+          <w:rFonts w:ascii="Calibri" w:hAnsi="Calibri" w:cs="Calibri"/>
+        </w:rPr>
+        <w:t>_</w:t>
+      </w:r>
+      <w:proofErr w:type="gramStart"/>
+      <w:r>
+        <w:rPr>
+          <w:rFonts w:ascii="Calibri" w:hAnsi="Calibri" w:cs="Calibri"/>
+        </w:rPr>
+        <w:t>items.remove</w:t>
+      </w:r>
+      <w:proofErr w:type="spellEnd"/>
+      <w:proofErr w:type="gramEnd"/>
       <w:r>
         <w:rPr>
           <w:rFonts w:ascii="Calibri" w:hAnsi="Calibri" w:cs="Calibri"/>
@@ -3522,9 +3802,24 @@
           <w:rFonts w:ascii="Calibri" w:hAnsi="Calibri" w:cs="Calibri"/>
         </w:rPr>
         <w:br/>
-        <w:t xml:space="preserve">                    print("Item Removed Successfully, Removed Item " + </w:t>
-      </w:r>
-      <w:proofErr w:type="spellStart"/>
+        <w:t xml:space="preserve">                    </w:t>
+      </w:r>
+      <w:proofErr w:type="gramStart"/>
+      <w:r>
+        <w:rPr>
+          <w:rFonts w:ascii="Calibri" w:hAnsi="Calibri" w:cs="Calibri"/>
+        </w:rPr>
+        <w:t>print(</w:t>
+      </w:r>
+      <w:proofErr w:type="gramEnd"/>
+      <w:r>
+        <w:rPr>
+          <w:rFonts w:ascii="Calibri" w:hAnsi="Calibri" w:cs="Calibri"/>
+        </w:rPr>
+        <w:t xml:space="preserve">"Item Removed Successfully, Removed Item " + </w:t>
+      </w:r>
+      <w:proofErr w:type="spellStart"/>
+      <w:proofErr w:type="gramStart"/>
       <w:r>
         <w:rPr>
           <w:rFonts w:ascii="Calibri" w:hAnsi="Calibri" w:cs="Calibri"/>
@@ -3532,6 +3827,7 @@
         <w:t>item.itemName.lower</w:t>
       </w:r>
       <w:proofErr w:type="spellEnd"/>
+      <w:proofErr w:type="gramEnd"/>
       <w:r>
         <w:rPr>
           <w:rFonts w:ascii="Calibri" w:hAnsi="Calibri" w:cs="Calibri"/>
@@ -3563,9 +3859,17 @@
           <w:rFonts w:ascii="Calibri" w:hAnsi="Calibri" w:cs="Calibri"/>
         </w:rPr>
         <w:br/>
-        <w:t xml:space="preserve">            print(</w:t>
-      </w:r>
-      <w:proofErr w:type="spellStart"/>
+        <w:t xml:space="preserve">            </w:t>
+      </w:r>
+      <w:proofErr w:type="gramStart"/>
+      <w:r>
+        <w:rPr>
+          <w:rFonts w:ascii="Calibri" w:hAnsi="Calibri" w:cs="Calibri"/>
+        </w:rPr>
+        <w:t>print(</w:t>
+      </w:r>
+      <w:proofErr w:type="spellStart"/>
+      <w:proofErr w:type="gramEnd"/>
       <w:r>
         <w:rPr>
           <w:rFonts w:ascii="Calibri" w:hAnsi="Calibri" w:cs="Calibri"/>
@@ -3624,14 +3928,28 @@
         <w:rPr>
           <w:rFonts w:ascii="Calibri" w:hAnsi="Calibri" w:cs="Calibri"/>
         </w:rPr>
-        <w:t>modify_item</w:t>
-      </w:r>
-      <w:proofErr w:type="spellEnd"/>
-      <w:r>
-        <w:rPr>
-          <w:rFonts w:ascii="Calibri" w:hAnsi="Calibri" w:cs="Calibri"/>
-        </w:rPr>
-        <w:t>(self, item):</w:t>
+        <w:t>modify_</w:t>
+      </w:r>
+      <w:proofErr w:type="gramStart"/>
+      <w:r>
+        <w:rPr>
+          <w:rFonts w:ascii="Calibri" w:hAnsi="Calibri" w:cs="Calibri"/>
+        </w:rPr>
+        <w:t>item</w:t>
+      </w:r>
+      <w:proofErr w:type="spellEnd"/>
+      <w:r>
+        <w:rPr>
+          <w:rFonts w:ascii="Calibri" w:hAnsi="Calibri" w:cs="Calibri"/>
+        </w:rPr>
+        <w:t>(</w:t>
+      </w:r>
+      <w:proofErr w:type="gramEnd"/>
+      <w:r>
+        <w:rPr>
+          <w:rFonts w:ascii="Calibri" w:hAnsi="Calibri" w:cs="Calibri"/>
+        </w:rPr>
+        <w:t>self, item):</w:t>
       </w:r>
       <w:r>
         <w:rPr>
@@ -3641,11 +3959,19 @@
         <w:t xml:space="preserve">        if not </w:t>
       </w:r>
       <w:proofErr w:type="spellStart"/>
-      <w:r>
-        <w:rPr>
-          <w:rFonts w:ascii="Calibri" w:hAnsi="Calibri" w:cs="Calibri"/>
-        </w:rPr>
-        <w:t>self.cart_items</w:t>
+      <w:proofErr w:type="gramStart"/>
+      <w:r>
+        <w:rPr>
+          <w:rFonts w:ascii="Calibri" w:hAnsi="Calibri" w:cs="Calibri"/>
+        </w:rPr>
+        <w:t>self.cart</w:t>
+      </w:r>
+      <w:proofErr w:type="gramEnd"/>
+      <w:r>
+        <w:rPr>
+          <w:rFonts w:ascii="Calibri" w:hAnsi="Calibri" w:cs="Calibri"/>
+        </w:rPr>
+        <w:t>_items</w:t>
       </w:r>
       <w:proofErr w:type="spellEnd"/>
       <w:r>
@@ -3659,7 +3985,21 @@
           <w:rFonts w:ascii="Calibri" w:hAnsi="Calibri" w:cs="Calibri"/>
         </w:rPr>
         <w:br/>
-        <w:t xml:space="preserve">            print("Cart is empty. Nothing to modify.\n")</w:t>
+        <w:t xml:space="preserve">            </w:t>
+      </w:r>
+      <w:proofErr w:type="gramStart"/>
+      <w:r>
+        <w:rPr>
+          <w:rFonts w:ascii="Calibri" w:hAnsi="Calibri" w:cs="Calibri"/>
+        </w:rPr>
+        <w:t>print(</w:t>
+      </w:r>
+      <w:proofErr w:type="gramEnd"/>
+      <w:r>
+        <w:rPr>
+          <w:rFonts w:ascii="Calibri" w:hAnsi="Calibri" w:cs="Calibri"/>
+        </w:rPr>
+        <w:t>"Cart is empty. Nothing to modify.\n")</w:t>
       </w:r>
       <w:r>
         <w:rPr>
@@ -6989,13 +7329,12 @@
       <w:r>
         <w:rPr>
           <w:rFonts w:ascii="Calibri" w:hAnsi="Calibri" w:cs="Calibri"/>
-          <w:noProof/>
         </w:rPr>
         <w:drawing>
-          <wp:inline distT="0" distB="0" distL="0" distR="0" wp14:anchorId="11E82D5A" wp14:editId="107B057B">
-            <wp:extent cx="5943600" cy="3353435"/>
+          <wp:inline distT="0" distB="0" distL="0" distR="0" wp14:anchorId="3153C62F" wp14:editId="6D0A24C0">
+            <wp:extent cx="5943600" cy="3354705"/>
             <wp:effectExtent l="0" t="0" r="0" b="0"/>
-            <wp:docPr id="1509539150" name="Picture 1"/>
+            <wp:docPr id="663301870" name="Picture 1"/>
             <wp:cNvGraphicFramePr>
               <a:graphicFrameLocks xmlns:a="http://schemas.openxmlformats.org/drawingml/2006/main" noChangeAspect="1"/>
             </wp:cNvGraphicFramePr>
@@ -7003,7 +7342,7 @@
               <a:graphicData uri="http://schemas.openxmlformats.org/drawingml/2006/picture">
                 <pic:pic xmlns:pic="http://schemas.openxmlformats.org/drawingml/2006/picture">
                   <pic:nvPicPr>
-                    <pic:cNvPr id="1509539150" name=""/>
+                    <pic:cNvPr id="663301870" name=""/>
                     <pic:cNvPicPr/>
                   </pic:nvPicPr>
                   <pic:blipFill>
@@ -7015,7 +7354,7 @@
                   <pic:spPr>
                     <a:xfrm>
                       <a:off x="0" y="0"/>
-                      <a:ext cx="5943600" cy="3353435"/>
+                      <a:ext cx="5943600" cy="3354705"/>
                     </a:xfrm>
                     <a:prstGeom prst="rect">
                       <a:avLst/>
@@ -7048,48 +7387,27 @@
           <w:rFonts w:ascii="Calibri" w:hAnsi="Calibri" w:cs="Calibri"/>
         </w:rPr>
       </w:pPr>
-      <w:r>
-        <w:rPr>
-          <w:rFonts w:ascii="Calibri" w:hAnsi="Calibri" w:cs="Calibri"/>
-          <w:noProof/>
-        </w:rPr>
-        <w:lastRenderedPageBreak/>
-        <w:drawing>
-          <wp:inline distT="0" distB="0" distL="0" distR="0" wp14:anchorId="704AA800" wp14:editId="2F27C645">
-            <wp:extent cx="5943600" cy="2331720"/>
-            <wp:effectExtent l="0" t="0" r="0" b="0"/>
-            <wp:docPr id="533708970" name="Picture 1"/>
-            <wp:cNvGraphicFramePr>
-              <a:graphicFrameLocks xmlns:a="http://schemas.openxmlformats.org/drawingml/2006/main" noChangeAspect="1"/>
-            </wp:cNvGraphicFramePr>
-            <a:graphic xmlns:a="http://schemas.openxmlformats.org/drawingml/2006/main">
-              <a:graphicData uri="http://schemas.openxmlformats.org/drawingml/2006/picture">
-                <pic:pic xmlns:pic="http://schemas.openxmlformats.org/drawingml/2006/picture">
-                  <pic:nvPicPr>
-                    <pic:cNvPr id="533708970" name=""/>
-                    <pic:cNvPicPr/>
-                  </pic:nvPicPr>
-                  <pic:blipFill>
-                    <a:blip r:embed="rId21"/>
-                    <a:stretch>
-                      <a:fillRect/>
-                    </a:stretch>
-                  </pic:blipFill>
-                  <pic:spPr>
-                    <a:xfrm>
-                      <a:off x="0" y="0"/>
-                      <a:ext cx="5943600" cy="2331720"/>
-                    </a:xfrm>
-                    <a:prstGeom prst="rect">
-                      <a:avLst/>
-                    </a:prstGeom>
-                  </pic:spPr>
-                </pic:pic>
-              </a:graphicData>
-            </a:graphic>
-          </wp:inline>
-        </w:drawing>
-      </w:r>
+    </w:p>
+    <w:p>
+      <w:pPr>
+        <w:rPr>
+          <w:rFonts w:ascii="Calibri" w:hAnsi="Calibri" w:cs="Calibri"/>
+        </w:rPr>
+      </w:pPr>
+    </w:p>
+    <w:p>
+      <w:pPr>
+        <w:rPr>
+          <w:rFonts w:ascii="Calibri" w:hAnsi="Calibri" w:cs="Calibri"/>
+        </w:rPr>
+      </w:pPr>
+    </w:p>
+    <w:p>
+      <w:pPr>
+        <w:rPr>
+          <w:rFonts w:ascii="Calibri" w:hAnsi="Calibri" w:cs="Calibri"/>
+        </w:rPr>
+      </w:pPr>
     </w:p>
     <w:sectPr>
       <w:pgSz w:w="12240" w:h="15840"/>

</xml_diff>